<commit_message>
Kim11_tema-2-dijital-unite-sonu-sorulari: gorsel alanlarina Shutter onizlemeleri yerlestirildi (2.3 bicimi)
</commit_message>
<xml_diff>
--- a/dijital/Kim11_tema-2-dijital-unite-sonu-sorulari.docx
+++ b/dijital/Kim11_tema-2-dijital-unite-sonu-sorulari.docx
@@ -280,85 +280,59 @@
         <w:t xml:space="preserve">Öğretmen çözeltiyi üç tüpe paylaştırıyor. Birinci tüpü sıcak su banyosuna koyduğunda çözeltinin maviye döndüğünü, tüpü buzlu suya aldığında yeniden pembeleştiğini gözlemliyor. İkinci tüpe derişik HCl çözeltisi damlattığında çözelti maviye dönüyor. Üçüncü tüpe ise saf su eklediğinde pembe rengin açıldığını görüyor.</w:t>
       </w:r>
     </w:p>
-    <w:tbl>
-      <w:tblPr>
-        <w:tblW w:w="9000" w:type="dxa"/>
+    <w:p>
+      <w:pPr>
         <w:jc w:val="center"/>
-        <w:tblBorders>
-          <w:top w:val="single" w:sz="8" w:space="0" w:color="7F7F7F"/>
-          <w:left w:val="single" w:sz="8" w:space="0" w:color="7F7F7F"/>
-          <w:bottom w:val="single" w:sz="8" w:space="0" w:color="7F7F7F"/>
-          <w:right w:val="single" w:sz="8" w:space="0" w:color="7F7F7F"/>
-        </w:tblBorders>
-      </w:tblPr>
-      <w:tblGrid>
-        <w:gridCol w:w="9000"/>
-      </w:tblGrid>
-      <w:tr>
-        <w:tc>
-          <w:tcPr>
-            <w:tcW w:w="9000" w:type="dxa"/>
-            <w:shd w:val="clear" w:color="auto" w:fill="EDEDED"/>
-          </w:tcPr>
-          <w:p>
-            <w:pPr>
-              <w:jc w:val="both"/>
-              <w:rPr>
-                <w:rFonts w:ascii="Times New Roman" w:hAnsi="Times New Roman" w:cs="Times New Roman"/>
-                <w:lang w:val="tr-TR"/>
-              </w:rPr>
-            </w:pPr>
-            <w:r>
-              <w:rPr>
-                <w:rFonts w:ascii="Times New Roman" w:hAnsi="Times New Roman" w:cs="Times New Roman"/>
-                <w:lang w:val="tr-TR"/>
-              </w:rPr>
-              <w:t xml:space="preserve">GÖRSEL ALANI (Shutterstock)</w:t>
-            </w:r>
-          </w:p>
-          <w:p>
-            <w:pPr>
-              <w:jc w:val="both"/>
-              <w:rPr>
-                <w:rFonts w:ascii="Times New Roman" w:hAnsi="Times New Roman" w:cs="Times New Roman"/>
-                <w:lang w:val="tr-TR"/>
-              </w:rPr>
-            </w:pPr>
-            <w:r>
-              <w:rPr>
-                <w:rFonts w:ascii="Times New Roman" w:hAnsi="Times New Roman" w:cs="Times New Roman"/>
-                <w:lang w:val="tr-TR"/>
-              </w:rPr>
-              <w:t xml:space="preserve">Tarif: Pembe ve mavi kobalt klorür çözeltisi içeren deney tüpleri yan yana; mümkünse vektörel çizim.</w:t>
-            </w:r>
-          </w:p>
-          <w:p>
-            <w:pPr>
-              <w:jc w:val="both"/>
-              <w:rPr>
-                <w:rFonts w:ascii="Times New Roman" w:hAnsi="Times New Roman" w:cs="Times New Roman"/>
-                <w:lang w:val="tr-TR"/>
-              </w:rPr>
-            </w:pPr>
-            <w:r>
-              <w:rPr>
-                <w:rFonts w:ascii="Times New Roman" w:hAnsi="Times New Roman" w:cs="Times New Roman"/>
-                <w:lang w:val="tr-TR"/>
-              </w:rPr>
-              <w:t xml:space="preserve">Shutter ID: 2641684673 (vektör) — Test tubes set with colored liquid chemical reagents (renkler pembe/mavi olarak düzenlenecek)</w:t>
-            </w:r>
-          </w:p>
-        </w:tc>
-      </w:tr>
-    </w:tbl>
+      </w:pPr>
+      <w:r>
+        <w:drawing>
+          <wp:inline xmlns:a="http://schemas.openxmlformats.org/drawingml/2006/main" xmlns:pic="http://schemas.openxmlformats.org/drawingml/2006/picture">
+            <wp:extent cx="5040000" cy="2274720"/>
+            <wp:docPr id="1" name="Picture 1"/>
+            <wp:cNvGraphicFramePr>
+              <a:graphicFrameLocks noChangeAspect="1"/>
+            </wp:cNvGraphicFramePr>
+            <a:graphic>
+              <a:graphicData uri="http://schemas.openxmlformats.org/drawingml/2006/picture">
+                <pic:pic>
+                  <pic:nvPicPr>
+                    <pic:cNvPr id="0" name="2641684673_d.jpg"/>
+                    <pic:cNvPicPr/>
+                  </pic:nvPicPr>
+                  <pic:blipFill>
+                    <a:blip r:embed="rId11"/>
+                    <a:stretch>
+                      <a:fillRect/>
+                    </a:stretch>
+                  </pic:blipFill>
+                  <pic:spPr>
+                    <a:xfrm>
+                      <a:off x="0" y="0"/>
+                      <a:ext cx="5040000" cy="2274720"/>
+                    </a:xfrm>
+                    <a:prstGeom prst="rect"/>
+                  </pic:spPr>
+                </pic:pic>
+              </a:graphicData>
+            </a:graphic>
+          </wp:inline>
+        </w:drawing>
+      </w:r>
+    </w:p>
     <w:p>
       <w:pPr>
-        <w:jc w:val="both"/>
-        <w:rPr>
-          <w:rFonts w:ascii="Times New Roman" w:hAnsi="Times New Roman" w:cs="Times New Roman"/>
-          <w:lang w:val="tr-TR"/>
-        </w:rPr>
-      </w:pPr>
+        <w:jc w:val="center"/>
+      </w:pPr>
+      <w:r>
+        <w:rPr>
+          <w:rFonts w:ascii="Times New Roman" w:hAnsi="Times New Roman" w:cs="Times New Roman"/>
+          <w:b/>
+          <w:bCs/>
+          <w:highlight w:val="yellow"/>
+          <w:lang w:val="tr-TR"/>
+        </w:rPr>
+        <w:t xml:space="preserve">Shutter id: 2641684673</w:t>
+      </w:r>
     </w:p>
     <w:p>
       <w:pPr>

</xml_diff>